<commit_message>
Complete the worked example with final migration timings and VM details
</commit_message>
<xml_diff>
--- a/SOP.docx
+++ b/SOP.docx
@@ -25488,7 +25488,7 @@
               <w:pStyle w:val="Compact"/>
             </w:pPr>
             <w:r>
-              <w:t xml:space="preserve">DiskTransferV2v</w:t>
+              <w:t xml:space="preserve">DiskTransferV2v (10240 MB)</w:t>
             </w:r>
           </w:p>
         </w:tc>
@@ -25510,16 +25510,19 @@
               <w:pStyle w:val="Compact"/>
             </w:pPr>
             <w:r>
-              <w:t xml:space="preserve">running at time of writing (1740 of 10240 MB at 15:36)</w:t>
-            </w:r>
-          </w:p>
-        </w:tc>
-        <w:tc>
-          <w:tcPr/>
-          <w:p>
-            <w:pPr>
-              <w:pStyle w:val="Compact"/>
-            </w:pPr>
+              <w:t xml:space="preserve">16:32:29</w:t>
+            </w:r>
+          </w:p>
+        </w:tc>
+        <w:tc>
+          <w:tcPr/>
+          <w:p>
+            <w:pPr>
+              <w:pStyle w:val="Compact"/>
+            </w:pPr>
+            <w:r>
+              <w:t xml:space="preserve">60 min 42 s</w:t>
+            </w:r>
           </w:p>
         </w:tc>
       </w:tr>
@@ -25541,22 +25544,93 @@
             <w:pPr>
               <w:pStyle w:val="Compact"/>
             </w:pPr>
-          </w:p>
-        </w:tc>
-        <w:tc>
-          <w:tcPr/>
-          <w:p>
-            <w:pPr>
-              <w:pStyle w:val="Compact"/>
-            </w:pPr>
-          </w:p>
-        </w:tc>
-        <w:tc>
-          <w:tcPr/>
-          <w:p>
-            <w:pPr>
-              <w:pStyle w:val="Compact"/>
-            </w:pPr>
+            <w:r>
+              <w:t xml:space="preserve">16:32:29</w:t>
+            </w:r>
+          </w:p>
+        </w:tc>
+        <w:tc>
+          <w:tcPr/>
+          <w:p>
+            <w:pPr>
+              <w:pStyle w:val="Compact"/>
+            </w:pPr>
+            <w:r>
+              <w:t xml:space="preserve">16:32:30</w:t>
+            </w:r>
+          </w:p>
+        </w:tc>
+        <w:tc>
+          <w:tcPr/>
+          <w:p>
+            <w:pPr>
+              <w:pStyle w:val="Compact"/>
+            </w:pPr>
+            <w:r>
+              <w:t xml:space="preserve">1 s</w:t>
+            </w:r>
+          </w:p>
+        </w:tc>
+      </w:tr>
+      <w:tr>
+        <w:tc>
+          <w:tcPr/>
+          <w:p>
+            <w:pPr>
+              <w:pStyle w:val="Compact"/>
+            </w:pPr>
+            <w:r>
+              <w:rPr>
+                <w:b/>
+                <w:bCs/>
+              </w:rPr>
+              <w:t xml:space="preserve">Total</w:t>
+            </w:r>
+          </w:p>
+        </w:tc>
+        <w:tc>
+          <w:tcPr/>
+          <w:p>
+            <w:pPr>
+              <w:pStyle w:val="Compact"/>
+            </w:pPr>
+            <w:r>
+              <w:rPr>
+                <w:b/>
+                <w:bCs/>
+              </w:rPr>
+              <w:t xml:space="preserve">15:08:05</w:t>
+            </w:r>
+          </w:p>
+        </w:tc>
+        <w:tc>
+          <w:tcPr/>
+          <w:p>
+            <w:pPr>
+              <w:pStyle w:val="Compact"/>
+            </w:pPr>
+            <w:r>
+              <w:rPr>
+                <w:b/>
+                <w:bCs/>
+              </w:rPr>
+              <w:t xml:space="preserve">16:32:30</w:t>
+            </w:r>
+          </w:p>
+        </w:tc>
+        <w:tc>
+          <w:tcPr/>
+          <w:p>
+            <w:pPr>
+              <w:pStyle w:val="Compact"/>
+            </w:pPr>
+            <w:r>
+              <w:rPr>
+                <w:b/>
+                <w:bCs/>
+              </w:rPr>
+              <w:t xml:space="preserve">1 h 24 min 25 s</w:t>
+            </w:r>
           </w:p>
         </w:tc>
       </w:tr>
@@ -25566,6 +25640,488 @@
         <w:pStyle w:val="BodyText"/>
       </w:pPr>
       <w:r>
+        <w:t xml:space="preserve">The final state, captured as the plan finished:</w:t>
+      </w:r>
+    </w:p>
+    <w:p>
+      <w:pPr>
+        <w:pStyle w:val="SourceCode"/>
+      </w:pPr>
+      <w:r>
+        <w:rPr>
+          <w:rStyle w:val="VerbatimChar"/>
+        </w:rPr>
+        <w:t xml:space="preserve">$ oc get plan test-ubuntu -n openshift-mtv</w:t>
+      </w:r>
+      <w:r>
+        <w:br/>
+      </w:r>
+      <w:r>
+        <w:rPr>
+          <w:rStyle w:val="VerbatimChar"/>
+        </w:rPr>
+        <w:t xml:space="preserve">NAME          READY   EXECUTING   SUCCEEDED   FAILED   AGE</w:t>
+      </w:r>
+      <w:r>
+        <w:br/>
+      </w:r>
+      <w:r>
+        <w:rPr>
+          <w:rStyle w:val="VerbatimChar"/>
+        </w:rPr>
+        <w:t xml:space="preserve">test-ubuntu   True                True                 124m</w:t>
+      </w:r>
+      <w:r>
+        <w:br/>
+      </w:r>
+      <w:r>
+        <w:br/>
+      </w:r>
+      <w:r>
+        <w:rPr>
+          <w:rStyle w:val="VerbatimChar"/>
+        </w:rPr>
+        <w:t xml:space="preserve">$ oc get migration -n openshift-mtv</w:t>
+      </w:r>
+      <w:r>
+        <w:br/>
+      </w:r>
+      <w:r>
+        <w:rPr>
+          <w:rStyle w:val="VerbatimChar"/>
+        </w:rPr>
+        <w:t xml:space="preserve">NAME            READY   RUNNING   SUCCEEDED   FAILED   AGE</w:t>
+      </w:r>
+      <w:r>
+        <w:br/>
+      </w:r>
+      <w:r>
+        <w:rPr>
+          <w:rStyle w:val="VerbatimChar"/>
+        </w:rPr>
+        <w:t xml:space="preserve">test-ubuntu-1   True              True                 123m</w:t>
+      </w:r>
+      <w:r>
+        <w:br/>
+      </w:r>
+      <w:r>
+        <w:br/>
+      </w:r>
+      <w:r>
+        <w:rPr>
+          <w:rStyle w:val="VerbatimChar"/>
+        </w:rPr>
+        <w:t xml:space="preserve">$ oc get plan test-ubuntu -n openshift-mtv -o jsonpath='{range .status.conditions[*]}{.type}{"\t"}{.status}{"\t"}{.message}{"\n"}{end}'</w:t>
+      </w:r>
+      <w:r>
+        <w:br/>
+      </w:r>
+      <w:r>
+        <w:rPr>
+          <w:rStyle w:val="VerbatimChar"/>
+        </w:rPr>
+        <w:t xml:space="preserve">Ready      True   The migration plan is ready.</w:t>
+      </w:r>
+      <w:r>
+        <w:br/>
+      </w:r>
+      <w:r>
+        <w:rPr>
+          <w:rStyle w:val="VerbatimChar"/>
+        </w:rPr>
+        <w:t xml:space="preserve">Succeeded  True   The plan execution has SUCCEEDED.</w:t>
+      </w:r>
+      <w:r>
+        <w:br/>
+      </w:r>
+      <w:r>
+        <w:br/>
+      </w:r>
+      <w:r>
+        <w:rPr>
+          <w:rStyle w:val="VerbatimChar"/>
+        </w:rPr>
+        <w:t xml:space="preserve">$ oc get vm,pvc -n mtv-test</w:t>
+      </w:r>
+      <w:r>
+        <w:br/>
+      </w:r>
+      <w:r>
+        <w:rPr>
+          <w:rStyle w:val="VerbatimChar"/>
+        </w:rPr>
+        <w:t xml:space="preserve">NAME                                                     AGE   STATUS    READY</w:t>
+      </w:r>
+      <w:r>
+        <w:br/>
+      </w:r>
+      <w:r>
+        <w:rPr>
+          <w:rStyle w:val="VerbatimChar"/>
+        </w:rPr>
+        <w:t xml:space="preserve">virtualmachine.kubevirt.io/ubuntu-noble-24.04-cloudimg   39m   Stopped   False</w:t>
+      </w:r>
+      <w:r>
+        <w:br/>
+      </w:r>
+      <w:r>
+        <w:br/>
+      </w:r>
+      <w:r>
+        <w:rPr>
+          <w:rStyle w:val="VerbatimChar"/>
+        </w:rPr>
+        <w:t xml:space="preserve">NAME                                              STATUS   VOLUME                                     CAPACITY      ACCESS MODES   STORAGECLASS</w:t>
+      </w:r>
+      <w:r>
+        <w:br/>
+      </w:r>
+      <w:r>
+        <w:rPr>
+          <w:rStyle w:val="VerbatimChar"/>
+        </w:rPr>
+        <w:t xml:space="preserve">persistentvolumeclaim/test-ubuntu-vm-2275-dm9s9   Bound    pvc-e18f93ca-a91e-46e9-9306-2bda130b4efd   11381663335   RWX            nfs-csi</w:t>
+      </w:r>
+    </w:p>
+    <w:p>
+      <w:pPr>
+        <w:pStyle w:val="FirstParagraph"/>
+      </w:pPr>
+      <w:r>
+        <w:t xml:space="preserve">What MTV built from the vSphere VM (fields from</w:t>
+      </w:r>
+      <w:r>
+        <w:t xml:space="preserve"> </w:t>
+      </w:r>
+      <w:r>
+        <w:rPr>
+          <w:rStyle w:val="VerbatimChar"/>
+        </w:rPr>
+        <w:t xml:space="preserve">oc get vm ubuntu-noble-24.04-cloudimg -n mtv-test -o yaml</w:t>
+      </w:r>
+      <w:r>
+        <w:t xml:space="preserve">):</w:t>
+      </w:r>
+    </w:p>
+    <w:tbl>
+      <w:tblPr>
+        <w:tblStyle w:val="Table"/>
+        <w:tblW w:type="auto" w:w="0"/>
+        <w:tblLook w:firstRow="1" w:lastRow="0" w:firstColumn="0" w:lastColumn="0" w:noHBand="0" w:noVBand="0" w:val="0020"/>
+      </w:tblPr>
+      <w:tblGrid>
+        <w:gridCol w:w="2640"/>
+        <w:gridCol w:w="2640"/>
+        <w:gridCol w:w="2640"/>
+      </w:tblGrid>
+      <w:tr>
+        <w:trPr>
+          <w:tblHeader w:val="on"/>
+        </w:trPr>
+        <w:tc>
+          <w:tcPr/>
+          <w:p>
+            <w:pPr>
+              <w:pStyle w:val="Compact"/>
+            </w:pPr>
+            <w:r>
+              <w:t xml:space="preserve">Field</w:t>
+            </w:r>
+          </w:p>
+        </w:tc>
+        <w:tc>
+          <w:tcPr/>
+          <w:p>
+            <w:pPr>
+              <w:pStyle w:val="Compact"/>
+            </w:pPr>
+            <w:r>
+              <w:t xml:space="preserve">Value</w:t>
+            </w:r>
+          </w:p>
+        </w:tc>
+        <w:tc>
+          <w:tcPr/>
+          <w:p>
+            <w:pPr>
+              <w:pStyle w:val="Compact"/>
+            </w:pPr>
+            <w:r>
+              <w:t xml:space="preserve">Comes from</w:t>
+            </w:r>
+          </w:p>
+        </w:tc>
+      </w:tr>
+      <w:tr>
+        <w:tc>
+          <w:tcPr/>
+          <w:p>
+            <w:pPr>
+              <w:pStyle w:val="Compact"/>
+            </w:pPr>
+            <w:r>
+              <w:rPr>
+                <w:rStyle w:val="VerbatimChar"/>
+              </w:rPr>
+              <w:t xml:space="preserve">runStrategy</w:t>
+            </w:r>
+          </w:p>
+        </w:tc>
+        <w:tc>
+          <w:tcPr/>
+          <w:p>
+            <w:pPr>
+              <w:pStyle w:val="Compact"/>
+            </w:pPr>
+            <w:r>
+              <w:rPr>
+                <w:rStyle w:val="VerbatimChar"/>
+              </w:rPr>
+              <w:t xml:space="preserve">Halted</w:t>
+            </w:r>
+          </w:p>
+        </w:tc>
+        <w:tc>
+          <w:tcPr/>
+          <w:p>
+            <w:pPr>
+              <w:pStyle w:val="Compact"/>
+            </w:pPr>
+            <w:r>
+              <w:rPr>
+                <w:rStyle w:val="VerbatimChar"/>
+              </w:rPr>
+              <w:t xml:space="preserve">targetPowerState: auto</w:t>
+            </w:r>
+            <w:r>
+              <w:t xml:space="preserve"> </w:t>
+            </w:r>
+            <w:r>
+              <w:t xml:space="preserve">matches the source, which was powered off</w:t>
+            </w:r>
+          </w:p>
+        </w:tc>
+      </w:tr>
+      <w:tr>
+        <w:tc>
+          <w:tcPr/>
+          <w:p>
+            <w:pPr>
+              <w:pStyle w:val="Compact"/>
+            </w:pPr>
+            <w:r>
+              <w:rPr>
+                <w:rStyle w:val="VerbatimChar"/>
+              </w:rPr>
+              <w:t xml:space="preserve">cpu</w:t>
+            </w:r>
+          </w:p>
+        </w:tc>
+        <w:tc>
+          <w:tcPr/>
+          <w:p>
+            <w:pPr>
+              <w:pStyle w:val="Compact"/>
+            </w:pPr>
+            <w:r>
+              <w:t xml:space="preserve">2 sockets x 1 core</w:t>
+            </w:r>
+          </w:p>
+        </w:tc>
+        <w:tc>
+          <w:tcPr/>
+          <w:p>
+            <w:pPr>
+              <w:pStyle w:val="Compact"/>
+            </w:pPr>
+            <w:r>
+              <w:t xml:space="preserve">Source vCPU layout</w:t>
+            </w:r>
+          </w:p>
+        </w:tc>
+      </w:tr>
+      <w:tr>
+        <w:tc>
+          <w:tcPr/>
+          <w:p>
+            <w:pPr>
+              <w:pStyle w:val="Compact"/>
+            </w:pPr>
+            <w:r>
+              <w:rPr>
+                <w:rStyle w:val="VerbatimChar"/>
+              </w:rPr>
+              <w:t xml:space="preserve">memory.guest</w:t>
+            </w:r>
+          </w:p>
+        </w:tc>
+        <w:tc>
+          <w:tcPr/>
+          <w:p>
+            <w:pPr>
+              <w:pStyle w:val="Compact"/>
+            </w:pPr>
+            <w:r>
+              <w:rPr>
+                <w:rStyle w:val="VerbatimChar"/>
+              </w:rPr>
+              <w:t xml:space="preserve">1Gi</w:t>
+            </w:r>
+          </w:p>
+        </w:tc>
+        <w:tc>
+          <w:tcPr/>
+          <w:p>
+            <w:pPr>
+              <w:pStyle w:val="Compact"/>
+            </w:pPr>
+            <w:r>
+              <w:t xml:space="preserve">Source RAM</w:t>
+            </w:r>
+          </w:p>
+        </w:tc>
+      </w:tr>
+      <w:tr>
+        <w:tc>
+          <w:tcPr/>
+          <w:p>
+            <w:pPr>
+              <w:pStyle w:val="Compact"/>
+            </w:pPr>
+            <w:r>
+              <w:rPr>
+                <w:rStyle w:val="VerbatimChar"/>
+              </w:rPr>
+              <w:t xml:space="preserve">firmware</w:t>
+            </w:r>
+          </w:p>
+        </w:tc>
+        <w:tc>
+          <w:tcPr/>
+          <w:p>
+            <w:pPr>
+              <w:pStyle w:val="Compact"/>
+            </w:pPr>
+            <w:r>
+              <w:t xml:space="preserve">BIOS</w:t>
+            </w:r>
+          </w:p>
+        </w:tc>
+        <w:tc>
+          <w:tcPr/>
+          <w:p>
+            <w:pPr>
+              <w:pStyle w:val="Compact"/>
+            </w:pPr>
+            <w:r>
+              <w:t xml:space="preserve">Source firmware</w:t>
+            </w:r>
+          </w:p>
+        </w:tc>
+      </w:tr>
+      <w:tr>
+        <w:tc>
+          <w:tcPr/>
+          <w:p>
+            <w:pPr>
+              <w:pStyle w:val="Compact"/>
+            </w:pPr>
+            <w:r>
+              <w:rPr>
+                <w:rStyle w:val="VerbatimChar"/>
+              </w:rPr>
+              <w:t xml:space="preserve">networks</w:t>
+            </w:r>
+          </w:p>
+        </w:tc>
+        <w:tc>
+          <w:tcPr/>
+          <w:p>
+            <w:pPr>
+              <w:pStyle w:val="Compact"/>
+            </w:pPr>
+            <w:r>
+              <w:rPr>
+                <w:rStyle w:val="VerbatimChar"/>
+              </w:rPr>
+              <w:t xml:space="preserve">multus: default/vlan-110</w:t>
+            </w:r>
+          </w:p>
+        </w:tc>
+        <w:tc>
+          <w:tcPr/>
+          <w:p>
+            <w:pPr>
+              <w:pStyle w:val="Compact"/>
+            </w:pPr>
+            <w:r>
+              <w:t xml:space="preserve">NetworkMap</w:t>
+            </w:r>
+          </w:p>
+        </w:tc>
+      </w:tr>
+      <w:tr>
+        <w:tc>
+          <w:tcPr/>
+          <w:p>
+            <w:pPr>
+              <w:pStyle w:val="Compact"/>
+            </w:pPr>
+            <w:r>
+              <w:rPr>
+                <w:rStyle w:val="VerbatimChar"/>
+              </w:rPr>
+              <w:t xml:space="preserve">volumes</w:t>
+            </w:r>
+          </w:p>
+        </w:tc>
+        <w:tc>
+          <w:tcPr/>
+          <w:p>
+            <w:pPr>
+              <w:pStyle w:val="Compact"/>
+            </w:pPr>
+            <w:r>
+              <w:t xml:space="preserve">PVC</w:t>
+            </w:r>
+            <w:r>
+              <w:t xml:space="preserve"> </w:t>
+            </w:r>
+            <w:r>
+              <w:rPr>
+                <w:rStyle w:val="VerbatimChar"/>
+              </w:rPr>
+              <w:t xml:space="preserve">test-ubuntu-vm-2275-dm9s9</w:t>
+            </w:r>
+          </w:p>
+        </w:tc>
+        <w:tc>
+          <w:tcPr/>
+          <w:p>
+            <w:pPr>
+              <w:pStyle w:val="Compact"/>
+            </w:pPr>
+            <w:r>
+              <w:t xml:space="preserve">StorageMap (</w:t>
+            </w:r>
+            <w:r>
+              <w:rPr>
+                <w:rStyle w:val="VerbatimChar"/>
+              </w:rPr>
+              <w:t xml:space="preserve">nfs-csi</w:t>
+            </w:r>
+            <w:r>
+              <w:t xml:space="preserve">); the PVC is slightly larger than 10 GiB to leave room for filesystem overhead</w:t>
+            </w:r>
+          </w:p>
+        </w:tc>
+      </w:tr>
+    </w:tbl>
+    <w:p>
+      <w:pPr>
+        <w:pStyle w:val="BodyText"/>
+      </w:pPr>
+      <w:r>
         <w:rPr>
           <w:b/>
           <w:bCs/>
@@ -25585,7 +26141,7 @@
         <w:t xml:space="preserve">nbdkit curl</w:t>
       </w:r>
       <w:r>
-        <w:t xml:space="preserve">). For 10 GiB that is acceptable in a lab; for production disk sizes it is not. Section 12 is mandatory for production.</w:t>
+        <w:t xml:space="preserve">). Here that came to about 2.8 MB/s: one hour to copy 10 GiB, plus 23 minutes of conversion. At that rate a 500 GiB production disk would take more than two days, so section 12 (VDDK) is mandatory for production.</w:t>
       </w:r>
     </w:p>
     <w:bookmarkEnd w:id="81"/>

</xml_diff>